<commit_message>
Move markdown source files into MD/ subfolders
Reorganizes 27R/, Winnebago_View_2020/, and Winnebago_View_2020/Fridge/
so the top level of each folder only shows the deliverables (.docx,
.pdf) plus a README, with the .md working sources tucked into an MD/
subfolder — matching the convention already used in the Camping repo's
EuropeCampering folder. Updated all cross-document relative links and
README indexes accordingly, and regenerated the .docx files whose
source links changed.

Also picks up the previously-uncommitted Fridge/ folder (DMC4101
fridge documentation) since its .md files needed the same move.
</commit_message>
<xml_diff>
--- a/27R/27R_12V_Fuse_and_Breaker_Panel_Location.docx
+++ b/27R/27R_12V_Fuse_and_Breaker_Panel_Location.docx
@@ -7,7 +7,7 @@
         <w:pStyle w:val="Title"/>
       </w:pPr>
       <w:r>
-        <w:t>2027 Winnebago View (27R) — 12V Fuse/Breaker Panel Location</w:t>
+        <w:t>2027 Winnebago View (27R) - 12V Fuse/Breaker Panel Location</w:t>
       </w:r>
     </w:p>
     <w:p>
@@ -23,7 +23,7 @@
         <w:pStyle w:val="ListBullet"/>
       </w:pPr>
       <w:r>
-        <w:t>Winnebago_View_2027_Operator_Manual.pdf (Winnebago_View_2027_Operator_Manual.pdf) — Section 7 (Electrical)</w:t>
+        <w:t>Winnebago_View_2027_Operator_Manual.pdf (../Winnebago_View_2027_Operator_Manual.pdf) — Section 7 (Electrical)</w:t>
       </w:r>
     </w:p>
     <w:p>
@@ -31,7 +31,7 @@
         <w:pStyle w:val="ListBullet"/>
       </w:pPr>
       <w:r>
-        <w:t>Wiring_Diagrams/Wiring_Diagram_12Volt.pdf (Wiring_Diagrams/Wiring_Diagram_12Volt.pdf) (point-to-point 12V wiring, View/Navion 524R2)</w:t>
+        <w:t>Wiring_Diagrams/Wiring_Diagram_12Volt.pdf (../Wiring_Diagrams/Wiring_Diagram_12Volt.pdf) (point-to-point 12V wiring, View/Navion 524R2)</w:t>
       </w:r>
     </w:p>
     <w:p>
@@ -39,7 +39,7 @@
         <w:pStyle w:val="ListBullet"/>
       </w:pPr>
       <w:r>
-        <w:t>Wiring_Diagrams/Body_12V_Wiring_Installation.pdf (Wiring_Diagrams/Body_12V_Wiring_Installation.pdf) (body 12V installation drawing)</w:t>
+        <w:t>Wiring_Diagrams/Body_12V_Wiring_Installation.pdf (../Wiring_Diagrams/Body_12V_Wiring_Installation.pdf) (body 12V installation drawing)</w:t>
       </w:r>
     </w:p>
     <w:p>
@@ -47,7 +47,7 @@
         <w:pStyle w:val="ListBullet"/>
       </w:pPr>
       <w:r>
-        <w:t>Wiring_Diagrams/Wire_Identification_Chart.pdf (Wiring_Diagrams/Wire_Identification_Chart.pdf) (wire color/code legend)</w:t>
+        <w:t>Wiring_Diagrams/Wire_Identification_Chart.pdf (../Wiring_Diagrams/Wire_Identification_Chart.pdf) (wire color/code legend)</w:t>
       </w:r>
     </w:p>
     <w:p>

</xml_diff>